<commit_message>
QC: report v2.2 revised - every good/bad point as where it is today, example, what to do; tighter docx
Co-Authored-By: Claude Opus 5.5 <noreply@anthropic.com>
</commit_message>
<xml_diff>
--- a/QC_report/module-c-report-v2.2.docx
+++ b/QC_report/module-c-report-v2.2.docx
@@ -45,7 +45,7 @@
         <w:t xml:space="preserve">What this report is for:</w:t>
       </w:r>
       <w:r>
-        <w:t xml:space="preserve"> to show what works in Module C and what doesn't, with real examples from the app, and what should be done to make it better.</w:t>
+        <w:t xml:space="preserve"> what's good and what's bad in Module C, where each thing is in the app today, an example of it, and what to do about it.</w:t>
       </w:r>
     </w:p>
     <w:p>
@@ -238,7 +238,7 @@
           <w:sz w:val="22"/>
           <w:szCs w:val="22"/>
         </w:rPr>
-        <w:t xml:space="preserve">3. What's bad, with an example and the fix (most serious first)</w:t>
+        <w:t xml:space="preserve">3. What's bad (most serious first)</w:t>
       </w:r>
     </w:p>
     <w:p>
@@ -363,7 +363,6 @@
     <w:p>
       <w:pPr>
         <w:pStyle w:val="Heading1"/>
-        <w:pageBreakBefore/>
       </w:pPr>
       <w:r>
         <w:t xml:space="preserve">2. What's good</w:t>
@@ -374,12 +373,15 @@
         <w:bidi w:val="false"/>
         <w:spacing w:after="100"/>
       </w:pPr>
+      <w:r>
+        <w:t xml:space="preserve">Each point: </w:t>
+      </w:r>
       <w:r>
         <w:rPr>
           <w:b/>
           <w:bCs/>
         </w:rPr>
-        <w:t xml:space="preserve">1. A clear method for the reading test.</w:t>
+        <w:t xml:space="preserve">where it is in the app today · an example · what to do with it.</w:t>
       </w:r>
     </w:p>
     <w:p>
@@ -387,281 +389,12 @@
         <w:bidi w:val="false"/>
         <w:spacing w:after="100"/>
       </w:pPr>
-      <w:r>
-        <w:rPr>
-          <w:i/>
-          <w:iCs/>
-        </w:rPr>
-        <w:t xml:space="preserve">Example:</w:t>
-      </w:r>
-      <w:r>
-        <w:t xml:space="preserve"> the first reading lesson (</w:t>
-      </w:r>
       <w:r>
         <w:rPr>
           <w:b/>
           <w:bCs/>
-          <w:rtl/>
-        </w:rPr>
-        <w:t xml:space="preserve">אני מחפש, לא קורא</w:t>
-      </w:r>
-      <w:r>
-        <w:t xml:space="preserve">) compares the exam to a WhatsApp group with 500 messages: to find the exam date you search for "exam", you don't read from the top. Then it teaches how to do the same with a text.</w:t>
-      </w:r>
-    </w:p>
-    <w:p>
-      <w:pPr>
-        <w:bidi w:val="false"/>
-        <w:spacing w:after="100"/>
-      </w:pPr>
-      <w:r>
-        <w:rPr>
-          <w:b/>
-          <w:bCs/>
-        </w:rPr>
-        <w:t xml:space="preserve">2. The traffic light: first make sure you understand the question.</w:t>
-      </w:r>
-    </w:p>
-    <w:p>
-      <w:pPr>
-        <w:bidi w:val="false"/>
-        <w:spacing w:after="100"/>
-      </w:pPr>
-      <w:r>
-        <w:rPr>
-          <w:i/>
-          <w:iCs/>
-        </w:rPr>
-        <w:t xml:space="preserve">Example:</w:t>
-      </w:r>
-      <w:r>
-        <w:t xml:space="preserve"> "What has the project achieved so far?" is 🟡 yellow: check </w:t>
-      </w:r>
-      <w:r>
-        <w:rPr>
-          <w:i/>
-          <w:iCs/>
-        </w:rPr>
-        <w:t xml:space="preserve">achieved</w:t>
-      </w:r>
-      <w:r>
-        <w:t xml:space="preserve"> and </w:t>
-      </w:r>
-      <w:r>
-        <w:rPr>
-          <w:i/>
-          <w:iCs/>
-        </w:rPr>
-        <w:t xml:space="preserve">so far</w:t>
-      </w:r>
-      <w:r>
-        <w:t xml:space="preserve"> in the dictionary, and only then look for the answer.</w:t>
-      </w:r>
-    </w:p>
-    <w:p>
-      <w:pPr>
-        <w:bidi w:val="false"/>
-        <w:spacing w:after="100"/>
-      </w:pPr>
-      <w:r>
-        <w:rPr>
-          <w:b/>
-          <w:bCs/>
-        </w:rPr>
-        <w:t xml:space="preserve">3. The words that tell you what to write are taught on their own.</w:t>
-      </w:r>
-    </w:p>
-    <w:p>
-      <w:pPr>
-        <w:bidi w:val="false"/>
-        <w:spacing w:after="100"/>
-      </w:pPr>
-      <w:r>
-        <w:rPr>
-          <w:i/>
-          <w:iCs/>
-        </w:rPr>
-        <w:t xml:space="preserve">Example:</w:t>
-      </w:r>
-      <w:r>
-        <w:t xml:space="preserve"> "Give TWO answers" means (1) and (2), not one long sentence with "and". Students often lose points on exactly this.</w:t>
-      </w:r>
-    </w:p>
-    <w:p>
-      <w:pPr>
-        <w:bidi w:val="false"/>
-        <w:spacing w:after="100"/>
-      </w:pPr>
-      <w:r>
-        <w:rPr>
-          <w:b/>
-          <w:bCs/>
-        </w:rPr>
-        <w:t xml:space="preserve">4. Vocabulary questions that make you really know the word.</w:t>
-      </w:r>
-    </w:p>
-    <w:p>
-      <w:pPr>
-        <w:bidi w:val="false"/>
-        <w:spacing w:after="100"/>
-      </w:pPr>
-      <w:r>
-        <w:rPr>
-          <w:i/>
-          <w:iCs/>
-        </w:rPr>
-        <w:t xml:space="preserve">Example:</w:t>
-      </w:r>
-      <w:r>
-        <w:t xml:space="preserve"> "Every member of ___ should follow the law": </w:t>
-      </w:r>
-      <w:r>
-        <w:rPr>
-          <w:i/>
-          <w:iCs/>
-        </w:rPr>
-        <w:t xml:space="preserve">social / society / societies / socially</w:t>
-      </w:r>
-      <w:r>
-        <w:t xml:space="preserve">. You can't guess; you need to know which form fits. Each explanation says why the other choices are wrong.</w:t>
-      </w:r>
-    </w:p>
-    <w:p>
-      <w:pPr>
-        <w:bidi w:val="false"/>
-        <w:spacing w:after="100"/>
-      </w:pPr>
-      <w:r>
-        <w:rPr>
-          <w:b/>
-          <w:bCs/>
-        </w:rPr>
-        <w:t xml:space="preserve">5. Spelling by ear.</w:t>
-      </w:r>
-    </w:p>
-    <w:p>
-      <w:pPr>
-        <w:bidi w:val="false"/>
-        <w:spacing w:after="100"/>
-      </w:pPr>
-      <w:r>
-        <w:rPr>
-          <w:i/>
-          <w:iCs/>
-        </w:rPr>
-        <w:t xml:space="preserve">Example:</w:t>
-      </w:r>
-      <w:r>
-        <w:t xml:space="preserve"> the app says "residents", the student types it, and the Hebrew meaning (</w:t>
-      </w:r>
-      <w:r>
-        <w:rPr>
-          <w:rtl/>
-        </w:rPr>
-        <w:t xml:space="preserve">תושבים</w:t>
-      </w:r>
-      <w:r>
-        <w:t xml:space="preserve">) is shown as a hint. Copying the word from the screen is still there for weaker students.</w:t>
-      </w:r>
-    </w:p>
-    <w:p>
-      <w:pPr>
-        <w:bidi w:val="false"/>
-        <w:spacing w:after="100"/>
-      </w:pPr>
-      <w:r>
-        <w:rPr>
-          <w:b/>
-          <w:bCs/>
-        </w:rPr>
-        <w:t xml:space="preserve">6. Reading lessons that end with a new text.</w:t>
-      </w:r>
-    </w:p>
-    <w:p>
-      <w:pPr>
-        <w:bidi w:val="false"/>
-        <w:spacing w:after="100"/>
-      </w:pPr>
-      <w:r>
-        <w:rPr>
-          <w:i/>
-          <w:iCs/>
-        </w:rPr>
-        <w:t xml:space="preserve">Example:</w:t>
-      </w:r>
-      <w:r>
-        <w:t xml:space="preserve"> the NOT lessons now end with a text the student hasn't seen, about a school that banned phones, and the student must finish it before moving on.</w:t>
-      </w:r>
-    </w:p>
-    <w:p>
-      <w:pPr>
-        <w:bidi w:val="false"/>
-        <w:spacing w:after="100"/>
-      </w:pPr>
-      <w:r>
-        <w:rPr>
-          <w:b/>
-          <w:bCs/>
-        </w:rPr>
-        <w:t xml:space="preserve">7. Writing built step by step.</w:t>
-      </w:r>
-    </w:p>
-    <w:p>
-      <w:pPr>
-        <w:bidi w:val="false"/>
-        <w:spacing w:after="100"/>
-      </w:pPr>
-      <w:r>
-        <w:rPr>
-          <w:i/>
-          <w:iCs/>
-        </w:rPr>
-        <w:t xml:space="preserve">Example:</w:t>
-      </w:r>
-      <w:r>
-        <w:t xml:space="preserve"> students learn why "I think students should volunteer </w:t>
-      </w:r>
-      <w:r>
-        <w:rPr>
-          <w:b/>
-          <w:bCs/>
-        </w:rPr>
-        <w:t xml:space="preserve">because it is good</w:t>
-      </w:r>
-      <w:r>
-        <w:t xml:space="preserve">" is weak, and "...</w:t>
-      </w:r>
-      <w:r>
-        <w:rPr>
-          <w:b/>
-          <w:bCs/>
-        </w:rPr>
-        <w:t xml:space="preserve">because they learn to care about others</w:t>
-      </w:r>
-      <w:r>
-        <w:t xml:space="preserve">" is strong.</w:t>
-      </w:r>
-    </w:p>
-    <w:p>
-      <w:pPr>
-        <w:pStyle w:val="Heading1"/>
-        <w:pageBreakBefore/>
-      </w:pPr>
-      <w:r>
-        <w:t xml:space="preserve">3. What's bad, with an example and the fix (most serious first)</w:t>
-      </w:r>
-    </w:p>
-    <w:p>
-      <w:pPr>
-        <w:bidi w:val="false"/>
-        <w:spacing w:after="100"/>
-      </w:pPr>
-      <w:r>
-        <w:rPr>
-          <w:b/>
-          <w:bCs/>
-        </w:rPr>
-        <w:t xml:space="preserve">1. The practice exam results can mislead.</w:t>
+        </w:rPr>
+        <w:t xml:space="preserve">1. A clear method for the reading test.</w:t>
       </w:r>
     </w:p>
     <w:p>
@@ -679,20 +412,61 @@
           <w:i/>
           <w:iCs/>
         </w:rPr>
-        <w:t xml:space="preserve">Example:</w:t>
-      </w:r>
-      <w:r>
-        <w:t xml:space="preserve"> a student who answers only the multiple-choice questions, leaves every written answer and the essay empty, and gets 24 of the 39 checked points, sees </w:t>
+        <w:t xml:space="preserve">Where:</w:t>
+      </w:r>
+      <w:r>
+        <w:t xml:space="preserve"> Reading → the first four lessons: </w:t>
       </w:r>
       <w:r>
         <w:rPr>
           <w:b/>
           <w:bCs/>
-        </w:rPr>
-        <w:t xml:space="preserve">"passed"</w:t>
-      </w:r>
-      <w:r>
-        <w:t xml:space="preserve">. The essay shows as "0/30", as if it had been marked.</w:t>
+          <w:rtl/>
+        </w:rPr>
+        <w:t xml:space="preserve">אני מחפש, לא קורא</w:t>
+      </w:r>
+      <w:r>
+        <w:t xml:space="preserve">, </w:t>
+      </w:r>
+      <w:r>
+        <w:rPr>
+          <w:b/>
+          <w:bCs/>
+          <w:rtl/>
+        </w:rPr>
+        <w:t xml:space="preserve">מפת הדרכים</w:t>
+      </w:r>
+      <w:r>
+        <w:t xml:space="preserve">, </w:t>
+      </w:r>
+      <w:r>
+        <w:rPr>
+          <w:b/>
+          <w:bCs/>
+          <w:rtl/>
+        </w:rPr>
+        <w:t xml:space="preserve">שיטת הרמזור</w:t>
+      </w:r>
+      <w:r>
+        <w:t xml:space="preserve">, </w:t>
+      </w:r>
+      <w:r>
+        <w:rPr>
+          <w:b/>
+          <w:bCs/>
+        </w:rPr>
+        <w:t xml:space="preserve">P1 - </w:t>
+      </w:r>
+      <w:r>
+        <w:rPr>
+          <w:b/>
+          <w:bCs/>
+          <w:rtl/>
+        </w:rPr>
+        <w:t xml:space="preserve">ניווט בטקסט</w:t>
+      </w:r>
+      <w:r>
+        <w:t xml:space="preserve">.</w:t>
       </w:r>
     </w:p>
     <w:p>
@@ -710,10 +484,10 @@
           <w:i/>
           <w:iCs/>
         </w:rPr>
-        <w:t xml:space="preserve">Why:</w:t>
-      </w:r>
-      <w:r>
-        <w:t xml:space="preserve"> the app checks only 39 of the 100 points. The written answers and the essay (61 points) aren't checked at all.</w:t>
+        <w:t xml:space="preserve">Example:</w:t>
+      </w:r>
+      <w:r>
+        <w:t xml:space="preserve"> the first lesson compares the exam to a WhatsApp group with 500 messages: to find the exam date you search for "exam", you don't read from the top. Then it teaches how to do the same with a text.</w:t>
       </w:r>
     </w:p>
     <w:p>
@@ -731,32 +505,23 @@
           <w:i/>
           <w:iCs/>
         </w:rPr>
-        <w:t xml:space="preserve">Where:</w:t>
-      </w:r>
-      <w:r>
-        <w:t xml:space="preserve"> both practice exams, </w:t>
-      </w:r>
+        <w:t xml:space="preserve">What to do:</w:t>
+      </w:r>
+      <w:r>
+        <w:t xml:space="preserve"> keep it. Only fix one summary line that makes it sound like you never read (see bad point 3).</w:t>
+      </w:r>
+    </w:p>
+    <w:p>
+      <w:pPr>
+        <w:bidi w:val="false"/>
+        <w:spacing w:after="100"/>
+      </w:pPr>
       <w:r>
         <w:rPr>
           <w:b/>
           <w:bCs/>
-          <w:rtl/>
-        </w:rPr>
-        <w:t xml:space="preserve">משקפיים חכמות שעוזרות לעיוורים לראות</w:t>
-      </w:r>
-      <w:r>
-        <w:t xml:space="preserve"> and </w:t>
-      </w:r>
-      <w:r>
-        <w:rPr>
-          <w:b/>
-          <w:bCs/>
-          <w:rtl/>
-        </w:rPr>
-        <w:t xml:space="preserve">ידידות יוצאות דופן בין בעלי חיים</w:t>
-      </w:r>
-      <w:r>
-        <w:t xml:space="preserve">.</w:t>
+        </w:rPr>
+        <w:t xml:space="preserve">2. The traffic light: first make sure you understand the question.</w:t>
       </w:r>
     </w:p>
     <w:p>
@@ -774,23 +539,21 @@
           <w:i/>
           <w:iCs/>
         </w:rPr>
-        <w:t xml:space="preserve">Fix:</w:t>
-      </w:r>
-      <w:r>
-        <w:t xml:space="preserve"> no "passed / failed". Show "Checked: 24 of 39 points. Not checked: the written answers and the essay (61 points)."</w:t>
-      </w:r>
-    </w:p>
-    <w:p>
-      <w:pPr>
-        <w:bidi w:val="false"/>
-        <w:spacing w:after="100"/>
-      </w:pPr>
+        <w:t xml:space="preserve">Where:</w:t>
+      </w:r>
+      <w:r>
+        <w:t xml:space="preserve"> Reading → </w:t>
+      </w:r>
       <w:r>
         <w:rPr>
           <w:b/>
           <w:bCs/>
-        </w:rPr>
-        <w:t xml:space="preserve">2. A few questions have mistakes.</w:t>
+          <w:rtl/>
+        </w:rPr>
+        <w:t xml:space="preserve">שיטת הרמזור</w:t>
+      </w:r>
+      <w:r>
+        <w:t xml:space="preserve">, and it comes back in the later reading lessons before each question.</w:t>
       </w:r>
     </w:p>
     <w:p>
@@ -808,58 +571,30 @@
           <w:i/>
           <w:iCs/>
         </w:rPr>
-        <w:t xml:space="preserve">Example (two right answers):</w:t>
-      </w:r>
-      <w:r>
-        <w:t xml:space="preserve"> the text says "Some shop owners say they lose customers to the market, but others say the crowds help their business." The question asks "What do some shop owners say?", and both answers fit. </w:t>
+        <w:t xml:space="preserve">Example:</w:t>
+      </w:r>
+      <w:r>
+        <w:t xml:space="preserve"> "What has the project achieved so far?" is 🟡 yellow: check </w:t>
       </w:r>
       <w:r>
         <w:rPr>
           <w:i/>
           <w:iCs/>
         </w:rPr>
-        <w:t xml:space="preserve">Where:</w:t>
-      </w:r>
-      <w:r>
-        <w:t xml:space="preserve"> Reading → </w:t>
-      </w:r>
-      <w:r>
-        <w:rPr>
-          <w:b/>
-          <w:bCs/>
-        </w:rPr>
-        <w:t xml:space="preserve">however / but - </w:t>
-      </w:r>
-      <w:r>
-        <w:rPr>
-          <w:b/>
-          <w:bCs/>
-          <w:rtl/>
-        </w:rPr>
-        <w:t xml:space="preserve">כמו במבחן</w:t>
-      </w:r>
-      <w:r>
-        <w:t xml:space="preserve"> → round 3. </w:t>
+        <w:t xml:space="preserve">achieved</w:t>
+      </w:r>
+      <w:r>
+        <w:t xml:space="preserve"> and </w:t>
       </w:r>
       <w:r>
         <w:rPr>
           <w:i/>
           <w:iCs/>
         </w:rPr>
-        <w:t xml:space="preserve">Fix:</w:t>
-      </w:r>
-      <w:r>
-        <w:t xml:space="preserve"> ask "What do the </w:t>
-      </w:r>
-      <w:r>
-        <w:rPr>
-          <w:b/>
-          <w:bCs/>
-        </w:rPr>
-        <w:t xml:space="preserve">unhappy</w:t>
-      </w:r>
-      <w:r>
-        <w:t xml:space="preserve"> shop owners say?".</w:t>
+        <w:t xml:space="preserve">so far</w:t>
+      </w:r>
+      <w:r>
+        <w:t xml:space="preserve"> in the dictionary, and only then look for the answer.</w:t>
       </w:r>
     </w:p>
     <w:p>
@@ -877,48 +612,23 @@
           <w:i/>
           <w:iCs/>
         </w:rPr>
-        <w:t xml:space="preserve">Example (giveaway):</w:t>
-      </w:r>
-      <w:r>
-        <w:t xml:space="preserve"> question 2's right answer is "They can read words from books and signs out loud". Question 3 then asks to complete "The glasses can also read words from ___ out loud." </w:t>
-      </w:r>
-      <w:r>
-        <w:rPr>
-          <w:i/>
-          <w:iCs/>
-        </w:rPr>
-        <w:t xml:space="preserve">Where:</w:t>
-      </w:r>
-      <w:r>
-        <w:t xml:space="preserve"> practice exam </w:t>
-      </w:r>
+        <w:t xml:space="preserve">What to do:</w:t>
+      </w:r>
+      <w:r>
+        <w:t xml:space="preserve"> keep it.</w:t>
+      </w:r>
+    </w:p>
+    <w:p>
+      <w:pPr>
+        <w:bidi w:val="false"/>
+        <w:spacing w:after="100"/>
+      </w:pPr>
       <w:r>
         <w:rPr>
           <w:b/>
           <w:bCs/>
-          <w:rtl/>
-        </w:rPr>
-        <w:t xml:space="preserve">משקפיים חכמות</w:t>
-      </w:r>
-      <w:r>
-        <w:rPr>
-          <w:b/>
-          <w:bCs/>
-        </w:rPr>
-        <w:t xml:space="preserve">...</w:t>
-      </w:r>
-      <w:r>
-        <w:t xml:space="preserve">. </w:t>
-      </w:r>
-      <w:r>
-        <w:rPr>
-          <w:i/>
-          <w:iCs/>
-        </w:rPr>
-        <w:t xml:space="preserve">Fix:</w:t>
-      </w:r>
-      <w:r>
-        <w:t xml:space="preserve"> reword question 2's choices.</w:t>
+        </w:rPr>
+        <w:t xml:space="preserve">3. The words that tell you what to write are taught on their own.</w:t>
       </w:r>
     </w:p>
     <w:p>
@@ -936,20 +646,32 @@
           <w:i/>
           <w:iCs/>
         </w:rPr>
-        <w:t xml:space="preserve">Example (a right answer marked wrong):</w:t>
-      </w:r>
-      <w:r>
-        <w:t xml:space="preserve"> the fill-in expects "books, signs, and screens". A student who writes "books, signs, screens" is marked wrong. </w:t>
-      </w:r>
-      <w:r>
-        <w:rPr>
-          <w:i/>
-          <w:iCs/>
-        </w:rPr>
-        <w:t xml:space="preserve">Fix:</w:t>
-      </w:r>
-      <w:r>
-        <w:t xml:space="preserve"> accept small differences.</w:t>
+        <w:t xml:space="preserve">Where:</w:t>
+      </w:r>
+      <w:r>
+        <w:t xml:space="preserve"> Vocabulary → </w:t>
+      </w:r>
+      <w:r>
+        <w:rPr>
+          <w:b/>
+          <w:bCs/>
+          <w:rtl/>
+        </w:rPr>
+        <w:t xml:space="preserve">מילות שאלה: איפה ומה</w:t>
+      </w:r>
+      <w:r>
+        <w:t xml:space="preserve"> and </w:t>
+      </w:r>
+      <w:r>
+        <w:rPr>
+          <w:b/>
+          <w:bCs/>
+          <w:rtl/>
+        </w:rPr>
+        <w:t xml:space="preserve">מילות שאלה: איך עונים</w:t>
+      </w:r>
+      <w:r>
+        <w:t xml:space="preserve">.</w:t>
       </w:r>
     </w:p>
     <w:p>
@@ -967,41 +689,10 @@
           <w:i/>
           <w:iCs/>
         </w:rPr>
-        <w:t xml:space="preserve">Also:</w:t>
-      </w:r>
-      <w:r>
-        <w:t xml:space="preserve"> one writing question calls "think" a word of agreement (it shows an opinion); one writing answer (Writing → </w:t>
-      </w:r>
-      <w:r>
-        <w:rPr>
-          <w:b/>
-          <w:bCs/>
-        </w:rPr>
-        <w:t xml:space="preserve">In addition - </w:t>
-      </w:r>
-      <w:r>
-        <w:rPr>
-          <w:b/>
-          <w:bCs/>
-          <w:rtl/>
-        </w:rPr>
-        <w:t xml:space="preserve">סיבה שנייה</w:t>
-      </w:r>
-      <w:r>
-        <w:t xml:space="preserve">) can be argued either way.</w:t>
-      </w:r>
-    </w:p>
-    <w:p>
-      <w:pPr>
-        <w:bidi w:val="false"/>
-        <w:spacing w:after="100"/>
-      </w:pPr>
-      <w:r>
-        <w:rPr>
-          <w:b/>
-          <w:bCs/>
-        </w:rPr>
-        <w:t xml:space="preserve">3. Some tips are still taught as rules that are always true.</w:t>
+        <w:t xml:space="preserve">Example:</w:t>
+      </w:r>
+      <w:r>
+        <w:t xml:space="preserve"> "Give TWO answers" means (1) and (2), not one long sentence with "and". Students often lose points on exactly this.</w:t>
       </w:r>
     </w:p>
     <w:p>
@@ -1019,40 +710,23 @@
           <w:i/>
           <w:iCs/>
         </w:rPr>
-        <w:t xml:space="preserve">Example:</w:t>
-      </w:r>
-      <w:r>
-        <w:t xml:space="preserve"> a summary screen says "however / but = a turn; what comes after it = the point". But for "What problem do many adults have?" the answer comes </w:t>
-      </w:r>
-      <w:r>
-        <w:rPr>
-          <w:i/>
-          <w:iCs/>
-        </w:rPr>
-        <w:t xml:space="preserve">before</w:t>
-      </w:r>
-      <w:r>
-        <w:t xml:space="preserve"> however. Another lesson says "</w:t>
-      </w:r>
-      <w:r>
-        <w:rPr>
-          <w:i/>
-          <w:iCs/>
-        </w:rPr>
-        <w:t xml:space="preserve">most</w:t>
-      </w:r>
-      <w:r>
-        <w:t xml:space="preserve"> always means one answer", but "</w:t>
-      </w:r>
-      <w:r>
-        <w:rPr>
-          <w:i/>
-          <w:iCs/>
-        </w:rPr>
-        <w:t xml:space="preserve">most</w:t>
-      </w:r>
-      <w:r>
-        <w:t xml:space="preserve"> trees" means the majority.</w:t>
+        <w:t xml:space="preserve">What to do:</w:t>
+      </w:r>
+      <w:r>
+        <w:t xml:space="preserve"> keep it.</w:t>
+      </w:r>
+    </w:p>
+    <w:p>
+      <w:pPr>
+        <w:bidi w:val="false"/>
+        <w:spacing w:after="100"/>
+      </w:pPr>
+      <w:r>
+        <w:rPr>
+          <w:b/>
+          <w:bCs/>
+        </w:rPr>
+        <w:t xml:space="preserve">4. Vocabulary questions that make you really know the word.</w:t>
       </w:r>
     </w:p>
     <w:p>
@@ -1073,14 +747,7 @@
         <w:t xml:space="preserve">Where:</w:t>
       </w:r>
       <w:r>
-        <w:t xml:space="preserve"> Reading → </w:t>
-      </w:r>
-      <w:r>
-        <w:rPr>
-          <w:b/>
-          <w:bCs/>
-        </w:rPr>
-        <w:t xml:space="preserve">however / but - </w:t>
+        <w:t xml:space="preserve"> Vocabulary → the six content-word lessons (the best one is </w:t>
       </w:r>
       <w:r>
         <w:rPr>
@@ -1088,50 +755,10 @@
           <w:bCs/>
           <w:rtl/>
         </w:rPr>
-        <w:t xml:space="preserve">כמו במבחן</w:t>
-      </w:r>
-      <w:r>
-        <w:t xml:space="preserve"> (round 2), </w:t>
-      </w:r>
-      <w:r>
-        <w:rPr>
-          <w:b/>
-          <w:bCs/>
-        </w:rPr>
-        <w:t xml:space="preserve">most / only - </w:t>
-      </w:r>
-      <w:r>
-        <w:rPr>
-          <w:b/>
-          <w:bCs/>
-          <w:rtl/>
-        </w:rPr>
-        <w:t xml:space="preserve">תרגול שאלות</w:t>
-      </w:r>
-      <w:r>
-        <w:t xml:space="preserve">, </w:t>
-      </w:r>
-      <w:r>
-        <w:rPr>
-          <w:b/>
-          <w:bCs/>
-          <w:rtl/>
-        </w:rPr>
-        <w:t xml:space="preserve">שאלות 1 - סיכום</w:t>
-      </w:r>
-      <w:r>
-        <w:t xml:space="preserve">, and the summary in </w:t>
-      </w:r>
-      <w:r>
-        <w:rPr>
-          <w:b/>
-          <w:bCs/>
-          <w:rtl/>
-        </w:rPr>
-        <w:t xml:space="preserve">אני מחפש, לא קורא</w:t>
-      </w:r>
-      <w:r>
-        <w:t xml:space="preserve">.</w:t>
+        <w:t xml:space="preserve">מילות תוכן: אחריות חברתית</w:t>
+      </w:r>
+      <w:r>
+        <w:t xml:space="preserve">).</w:t>
       </w:r>
     </w:p>
     <w:p>
@@ -1149,23 +776,20 @@
           <w:i/>
           <w:iCs/>
         </w:rPr>
-        <w:t xml:space="preserve">Fix:</w:t>
-      </w:r>
-      <w:r>
-        <w:t xml:space="preserve"> say it as a hint: "usually the point comes after however, but always answer what the question asks".</w:t>
-      </w:r>
-    </w:p>
-    <w:p>
-      <w:pPr>
-        <w:bidi w:val="false"/>
-        <w:spacing w:after="100"/>
-      </w:pPr>
-      <w:r>
-        <w:rPr>
-          <w:b/>
-          <w:bCs/>
-        </w:rPr>
-        <w:t xml:space="preserve">4. The writing check doesn't look at what the student wrote.</w:t>
+        <w:t xml:space="preserve">Example:</w:t>
+      </w:r>
+      <w:r>
+        <w:t xml:space="preserve"> "Every member of ___ should follow the law": </w:t>
+      </w:r>
+      <w:r>
+        <w:rPr>
+          <w:i/>
+          <w:iCs/>
+        </w:rPr>
+        <w:t xml:space="preserve">social / society / societies / socially</w:t>
+      </w:r>
+      <w:r>
+        <w:t xml:space="preserve">. You can't guess; you need to know which form fits. Each explanation says why the other choices are wrong.</w:t>
       </w:r>
     </w:p>
     <w:p>
@@ -1183,10 +807,23 @@
           <w:i/>
           <w:iCs/>
         </w:rPr>
-        <w:t xml:space="preserve">Example:</w:t>
-      </w:r>
-      <w:r>
-        <w:t xml:space="preserve"> "In my opinion it is good because it is good. In addition it is good. In conclusion it is good." passes, because it has the linking words.</w:t>
+        <w:t xml:space="preserve">What to do:</w:t>
+      </w:r>
+      <w:r>
+        <w:t xml:space="preserve"> use the same style in the final vocabulary test, which is still mostly simple multiple choice (see bad point 9).</w:t>
+      </w:r>
+    </w:p>
+    <w:p>
+      <w:pPr>
+        <w:bidi w:val="false"/>
+        <w:spacing w:after="100"/>
+      </w:pPr>
+      <w:r>
+        <w:rPr>
+          <w:b/>
+          <w:bCs/>
+        </w:rPr>
+        <w:t xml:space="preserve">5. Spelling by ear.</w:t>
       </w:r>
     </w:p>
     <w:p>
@@ -1204,19 +841,21 @@
           <w:i/>
           <w:iCs/>
         </w:rPr>
-        <w:t xml:space="preserve">And:</w:t>
-      </w:r>
-      <w:r>
-        <w:t xml:space="preserve"> topic words from the word list (like "travel") never count, because the app looks for "travel / </w:t>
-      </w:r>
-      <w:r>
-        <w:rPr>
+        <w:t xml:space="preserve">Where:</w:t>
+      </w:r>
+      <w:r>
+        <w:t xml:space="preserve"> Vocabulary → the review round at the end of every lesson, and </w:t>
+      </w:r>
+      <w:r>
+        <w:rPr>
+          <w:b/>
+          <w:bCs/>
           <w:rtl/>
         </w:rPr>
-        <w:t xml:space="preserve">לטייל</w:t>
-      </w:r>
-      <w:r>
-        <w:t xml:space="preserve">" as one word.</w:t>
+        <w:t xml:space="preserve">מבחן סיכום - אוצר מילים</w:t>
+      </w:r>
+      <w:r>
+        <w:t xml:space="preserve">.</w:t>
       </w:r>
     </w:p>
     <w:p>
@@ -1234,10 +873,19 @@
           <w:i/>
           <w:iCs/>
         </w:rPr>
-        <w:t xml:space="preserve">Where:</w:t>
-      </w:r>
-      <w:r>
-        <w:t xml:space="preserve"> every writing screen in the Writing lessons.</w:t>
+        <w:t xml:space="preserve">Example:</w:t>
+      </w:r>
+      <w:r>
+        <w:t xml:space="preserve"> the app says "residents", the student types it, and the Hebrew meaning (</w:t>
+      </w:r>
+      <w:r>
+        <w:rPr>
+          <w:rtl/>
+        </w:rPr>
+        <w:t xml:space="preserve">תושבים</w:t>
+      </w:r>
+      <w:r>
+        <w:t xml:space="preserve">) is shown as a hint. Copying the word from the screen is still there for weaker students.</w:t>
       </w:r>
     </w:p>
     <w:p>
@@ -1255,10 +903,10 @@
           <w:i/>
           <w:iCs/>
         </w:rPr>
-        <w:t xml:space="preserve">Fix:</w:t>
-      </w:r>
-      <w:r>
-        <w:t xml:space="preserve"> count the English word alone; add a word counter; show an example of a good paragraph with a short checklist, clearly marked "check yourself, not graded".</w:t>
+        <w:t xml:space="preserve">What to do:</w:t>
+      </w:r>
+      <w:r>
+        <w:t xml:space="preserve"> check on an iPhone and an Android phone that the voice plays and is clear.</w:t>
       </w:r>
     </w:p>
     <w:p>
@@ -1271,7 +919,7 @@
           <w:b/>
           <w:bCs/>
         </w:rPr>
-        <w:t xml:space="preserve">5. Students never practise writing a full paragraph.</w:t>
+        <w:t xml:space="preserve">6. Reading lessons that end with a new text.</w:t>
       </w:r>
     </w:p>
     <w:p>
@@ -1289,10 +937,82 @@
           <w:i/>
           <w:iCs/>
         </w:rPr>
-        <w:t xml:space="preserve">Example:</w:t>
-      </w:r>
-      <w:r>
-        <w:t xml:space="preserve"> a topic lesson asks for "70-90 words", but gives five separate one-line boxes and no word count. Students never see a model answer.</w:t>
+        <w:t xml:space="preserve">Where:</w:t>
+      </w:r>
+      <w:r>
+        <w:t xml:space="preserve"> Reading → </w:t>
+      </w:r>
+      <w:r>
+        <w:rPr>
+          <w:b/>
+          <w:bCs/>
+        </w:rPr>
+        <w:t xml:space="preserve">NOT - </w:t>
+      </w:r>
+      <w:r>
+        <w:rPr>
+          <w:b/>
+          <w:bCs/>
+          <w:rtl/>
+        </w:rPr>
+        <w:t xml:space="preserve">המילה הכי מסוכנת</w:t>
+      </w:r>
+      <w:r>
+        <w:t xml:space="preserve"> + </w:t>
+      </w:r>
+      <w:r>
+        <w:rPr>
+          <w:b/>
+          <w:bCs/>
+        </w:rPr>
+        <w:t xml:space="preserve">NOT - </w:t>
+      </w:r>
+      <w:r>
+        <w:rPr>
+          <w:b/>
+          <w:bCs/>
+          <w:rtl/>
+        </w:rPr>
+        <w:t xml:space="preserve">תרגול שאלות</w:t>
+      </w:r>
+      <w:r>
+        <w:t xml:space="preserve">, and </w:t>
+      </w:r>
+      <w:r>
+        <w:rPr>
+          <w:b/>
+          <w:bCs/>
+        </w:rPr>
+        <w:t xml:space="preserve">however / but - </w:t>
+      </w:r>
+      <w:r>
+        <w:rPr>
+          <w:b/>
+          <w:bCs/>
+          <w:rtl/>
+        </w:rPr>
+        <w:t xml:space="preserve">סימון בטקסט</w:t>
+      </w:r>
+      <w:r>
+        <w:t xml:space="preserve"> + </w:t>
+      </w:r>
+      <w:r>
+        <w:rPr>
+          <w:b/>
+          <w:bCs/>
+        </w:rPr>
+        <w:t xml:space="preserve">however / but - </w:t>
+      </w:r>
+      <w:r>
+        <w:rPr>
+          <w:b/>
+          <w:bCs/>
+          <w:rtl/>
+        </w:rPr>
+        <w:t xml:space="preserve">כמו במבחן</w:t>
+      </w:r>
+      <w:r>
+        <w:t xml:space="preserve">.</w:t>
       </w:r>
     </w:p>
     <w:p>
@@ -1310,10 +1030,10 @@
           <w:i/>
           <w:iCs/>
         </w:rPr>
-        <w:t xml:space="preserve">Also:</w:t>
-      </w:r>
-      <w:r>
-        <w:t xml:space="preserve"> the writing practice in the seven short skill lessons can be skipped.</w:t>
+        <w:t xml:space="preserve">Example:</w:t>
+      </w:r>
+      <w:r>
+        <w:t xml:space="preserve"> the NOT lessons end with a text the student hasn't seen, about a school that banned phones, and the student must finish it before moving on.</w:t>
       </w:r>
     </w:p>
     <w:p>
@@ -1331,10 +1051,23 @@
           <w:i/>
           <w:iCs/>
         </w:rPr>
-        <w:t xml:space="preserve">Where:</w:t>
-      </w:r>
-      <w:r>
-        <w:t xml:space="preserve"> Writing → the four topic lessons (volunteering, vacation, school, cellphones) and the skill lessons.</w:t>
+        <w:t xml:space="preserve">What to do:</w:t>
+      </w:r>
+      <w:r>
+        <w:t xml:space="preserve"> do the same in the reading lessons that haven't been updated yet (see bad point 7).</w:t>
+      </w:r>
+    </w:p>
+    <w:p>
+      <w:pPr>
+        <w:bidi w:val="false"/>
+        <w:spacing w:after="100"/>
+      </w:pPr>
+      <w:r>
+        <w:rPr>
+          <w:b/>
+          <w:bCs/>
+        </w:rPr>
+        <w:t xml:space="preserve">7. Writing built step by step.</w:t>
       </w:r>
     </w:p>
     <w:p>
@@ -1352,23 +1085,46 @@
           <w:i/>
           <w:iCs/>
         </w:rPr>
-        <w:t xml:space="preserve">Fix:</w:t>
-      </w:r>
-      <w:r>
-        <w:t xml:space="preserve"> one paragraph box with a word counter (the practice exams already have one), an example paragraph, and make one full paragraph per topic lesson required (needs your OK).</w:t>
-      </w:r>
-    </w:p>
-    <w:p>
-      <w:pPr>
-        <w:bidi w:val="false"/>
-        <w:spacing w:after="100"/>
-      </w:pPr>
+        <w:t xml:space="preserve">Where:</w:t>
+      </w:r>
+      <w:r>
+        <w:t xml:space="preserve"> Writing → the seven skill lessons, from </w:t>
+      </w:r>
       <w:r>
         <w:rPr>
           <w:b/>
           <w:bCs/>
         </w:rPr>
-        <w:t xml:space="preserve">6. Some writing screens have lines stuck together.</w:t>
+        <w:t xml:space="preserve">YES or NO - </w:t>
+      </w:r>
+      <w:r>
+        <w:rPr>
+          <w:b/>
+          <w:bCs/>
+          <w:rtl/>
+        </w:rPr>
+        <w:t xml:space="preserve">לומר עמדה</w:t>
+      </w:r>
+      <w:r>
+        <w:t xml:space="preserve"> to </w:t>
+      </w:r>
+      <w:r>
+        <w:rPr>
+          <w:b/>
+          <w:bCs/>
+        </w:rPr>
+        <w:t xml:space="preserve">70-90 </w:t>
+      </w:r>
+      <w:r>
+        <w:rPr>
+          <w:b/>
+          <w:bCs/>
+          <w:rtl/>
+        </w:rPr>
+        <w:t xml:space="preserve">מילים - לספור</w:t>
+      </w:r>
+      <w:r>
+        <w:t xml:space="preserve">.</w:t>
       </w:r>
     </w:p>
     <w:p>
@@ -1389,16 +1145,27 @@
         <w:t xml:space="preserve">Example:</w:t>
       </w:r>
       <w:r>
-        <w:t xml:space="preserve"> "</w:t>
-      </w:r>
-      <w:r>
-        <w:rPr>
-          <w:rtl/>
-        </w:rPr>
-        <w:t xml:space="preserve">לא כתיב.לא דקדוק</w:t>
-      </w:r>
-      <w:r>
-        <w:t xml:space="preserve">" and "It helps...It improves...It teaches" run together on one line.</w:t>
+        <w:t xml:space="preserve"> students learn why "I think students should volunteer </w:t>
+      </w:r>
+      <w:r>
+        <w:rPr>
+          <w:b/>
+          <w:bCs/>
+        </w:rPr>
+        <w:t xml:space="preserve">because it is good</w:t>
+      </w:r>
+      <w:r>
+        <w:t xml:space="preserve">" is weak, and "...</w:t>
+      </w:r>
+      <w:r>
+        <w:rPr>
+          <w:b/>
+          <w:bCs/>
+        </w:rPr>
+        <w:t xml:space="preserve">because they learn to care about others</w:t>
+      </w:r>
+      <w:r>
+        <w:t xml:space="preserve">" is strong.</w:t>
       </w:r>
     </w:p>
     <w:p>
@@ -1416,64 +1183,23 @@
           <w:i/>
           <w:iCs/>
         </w:rPr>
-        <w:t xml:space="preserve">Where:</w:t>
-      </w:r>
-      <w:r>
-        <w:t xml:space="preserve"> Writing → opening screens of </w:t>
-      </w:r>
+        <w:t xml:space="preserve">What to do:</w:t>
+      </w:r>
+      <w:r>
+        <w:t xml:space="preserve"> add a full example paragraph and real paragraph practice (see bad points 4 and 5).</w:t>
+      </w:r>
+    </w:p>
+    <w:p>
+      <w:pPr>
+        <w:bidi w:val="false"/>
+        <w:spacing w:after="100"/>
+      </w:pPr>
       <w:r>
         <w:rPr>
           <w:b/>
           <w:bCs/>
         </w:rPr>
-        <w:t xml:space="preserve">YES or NO - </w:t>
-      </w:r>
-      <w:r>
-        <w:rPr>
-          <w:b/>
-          <w:bCs/>
-          <w:rtl/>
-        </w:rPr>
-        <w:t xml:space="preserve">לומר עמדה</w:t>
-      </w:r>
-      <w:r>
-        <w:t xml:space="preserve">, </w:t>
-      </w:r>
-      <w:r>
-        <w:rPr>
-          <w:b/>
-          <w:bCs/>
-        </w:rPr>
-        <w:t xml:space="preserve">What do you think? - </w:t>
-      </w:r>
-      <w:r>
-        <w:rPr>
-          <w:b/>
-          <w:bCs/>
-          <w:rtl/>
-        </w:rPr>
-        <w:t xml:space="preserve">חופשה</w:t>
-      </w:r>
-      <w:r>
-        <w:t xml:space="preserve">, </w:t>
-      </w:r>
-      <w:r>
-        <w:rPr>
-          <w:b/>
-          <w:bCs/>
-        </w:rPr>
-        <w:t xml:space="preserve">At what age? - </w:t>
-      </w:r>
-      <w:r>
-        <w:rPr>
-          <w:b/>
-          <w:bCs/>
-          <w:rtl/>
-        </w:rPr>
-        <w:t xml:space="preserve">פלאפונים</w:t>
-      </w:r>
-      <w:r>
-        <w:t xml:space="preserve">.</w:t>
+        <w:t xml:space="preserve">8. Practice exams that look like the real Bagrut.</w:t>
       </w:r>
     </w:p>
     <w:p>
@@ -1491,23 +1217,32 @@
           <w:i/>
           <w:iCs/>
         </w:rPr>
-        <w:t xml:space="preserve">Fix:</w:t>
-      </w:r>
-      <w:r>
-        <w:t xml:space="preserve"> tidy them, the way it was done for Vocabulary and Reading.</w:t>
-      </w:r>
-    </w:p>
-    <w:p>
-      <w:pPr>
-        <w:bidi w:val="false"/>
-        <w:spacing w:after="100"/>
-      </w:pPr>
+        <w:t xml:space="preserve">Where:</w:t>
+      </w:r>
+      <w:r>
+        <w:t xml:space="preserve"> the two practice exams, </w:t>
+      </w:r>
       <w:r>
         <w:rPr>
           <w:b/>
           <w:bCs/>
-        </w:rPr>
-        <w:t xml:space="preserve">7. Half of the reading lessons haven't been updated yet.</w:t>
+          <w:rtl/>
+        </w:rPr>
+        <w:t xml:space="preserve">משקפיים חכמות שעוזרות לעיוורים לראות</w:t>
+      </w:r>
+      <w:r>
+        <w:t xml:space="preserve"> and </w:t>
+      </w:r>
+      <w:r>
+        <w:rPr>
+          <w:b/>
+          <w:bCs/>
+          <w:rtl/>
+        </w:rPr>
+        <w:t xml:space="preserve">ידידות יוצאות דופן בין בעלי חיים</w:t>
+      </w:r>
+      <w:r>
+        <w:t xml:space="preserve">.</w:t>
       </w:r>
     </w:p>
     <w:p>
@@ -1528,7 +1263,7 @@
         <w:t xml:space="preserve">Example:</w:t>
       </w:r>
       <w:r>
-        <w:t xml:space="preserve"> the most/only lesson still has an easy true/false round ("true or false: MOST means one answer"), and students can move on without ever trying a new text.</w:t>
+        <w:t xml:space="preserve"> one text in 4 paragraphs, 9 questions of the same kinds as the Bagrut, and an essay such as "Which famous person would you like to give a talk at your school?".</w:t>
       </w:r>
     </w:p>
     <w:p>
@@ -1546,10 +1281,47 @@
           <w:i/>
           <w:iCs/>
         </w:rPr>
-        <w:t xml:space="preserve">Where:</w:t>
-      </w:r>
-      <w:r>
-        <w:t xml:space="preserve"> Reading → the numbers-and-names lessons, the most/only lessons, and the other single lessons.</w:t>
+        <w:t xml:space="preserve">What to do:</w:t>
+      </w:r>
+      <w:r>
+        <w:t xml:space="preserve"> fix the results screen (bad point 1), and make the texts a little longer (they're 230-280 words; the Bagrut's is about 340).</w:t>
+      </w:r>
+    </w:p>
+    <w:p>
+      <w:pPr>
+        <w:pStyle w:val="Heading1"/>
+      </w:pPr>
+      <w:r>
+        <w:t xml:space="preserve">3. What's bad (most serious first)</w:t>
+      </w:r>
+    </w:p>
+    <w:p>
+      <w:pPr>
+        <w:bidi w:val="false"/>
+        <w:spacing w:after="100"/>
+      </w:pPr>
+      <w:r>
+        <w:t xml:space="preserve">Each point: </w:t>
+      </w:r>
+      <w:r>
+        <w:rPr>
+          <w:b/>
+          <w:bCs/>
+        </w:rPr>
+        <w:t xml:space="preserve">where it is in the app today · an example · what to do.</w:t>
+      </w:r>
+    </w:p>
+    <w:p>
+      <w:pPr>
+        <w:bidi w:val="false"/>
+        <w:spacing w:after="100"/>
+      </w:pPr>
+      <w:r>
+        <w:rPr>
+          <w:b/>
+          <w:bCs/>
+        </w:rPr>
+        <w:t xml:space="preserve">1. The practice exam results can mislead.</w:t>
       </w:r>
     </w:p>
     <w:p>
@@ -1567,23 +1339,32 @@
           <w:i/>
           <w:iCs/>
         </w:rPr>
-        <w:t xml:space="preserve">Fix:</w:t>
-      </w:r>
-      <w:r>
-        <w:t xml:space="preserve"> the same pattern as the NOT and however lessons: rules, practice, then a required new text. Needs new texts.</w:t>
-      </w:r>
-    </w:p>
-    <w:p>
-      <w:pPr>
-        <w:bidi w:val="false"/>
-        <w:spacing w:after="100"/>
-      </w:pPr>
+        <w:t xml:space="preserve">Where:</w:t>
+      </w:r>
+      <w:r>
+        <w:t xml:space="preserve"> both practice exams, </w:t>
+      </w:r>
       <w:r>
         <w:rPr>
           <w:b/>
           <w:bCs/>
-        </w:rPr>
-        <w:t xml:space="preserve">8. The last reading lesson doesn't look like the exam.</w:t>
+          <w:rtl/>
+        </w:rPr>
+        <w:t xml:space="preserve">משקפיים חכמות שעוזרות לעיוורים לראות</w:t>
+      </w:r>
+      <w:r>
+        <w:t xml:space="preserve"> and </w:t>
+      </w:r>
+      <w:r>
+        <w:rPr>
+          <w:b/>
+          <w:bCs/>
+          <w:rtl/>
+        </w:rPr>
+        <w:t xml:space="preserve">ידידות יוצאות דופן בין בעלי חיים</w:t>
+      </w:r>
+      <w:r>
+        <w:t xml:space="preserve">: the results screen, and the exam's opening page.</w:t>
       </w:r>
     </w:p>
     <w:p>
@@ -1604,18 +1385,17 @@
         <w:t xml:space="preserve">Example:</w:t>
       </w:r>
       <w:r>
-        <w:t xml:space="preserve"> </w:t>
+        <w:t xml:space="preserve"> a student who answers only the multiple-choice questions, leaves every written answer and the essay empty, and gets 24 of the 39 checked points, sees </w:t>
       </w:r>
       <w:r>
         <w:rPr>
           <w:b/>
           <w:bCs/>
-          <w:rtl/>
-        </w:rPr>
-        <w:t xml:space="preserve">חלק 1 - סיכום</w:t>
-      </w:r>
-      <w:r>
-        <w:t xml:space="preserve"> has a 113-word text and only multiple-choice questions. The real exam has about 340 words and 9 questions, 5 of them written.</w:t>
+        </w:rPr>
+        <w:t xml:space="preserve">"passed"</w:t>
+      </w:r>
+      <w:r>
+        <w:t xml:space="preserve">. The essay shows as "0/30", as if it had been marked. The app checks only 39 of the 100 points.</w:t>
       </w:r>
     </w:p>
     <w:p>
@@ -1633,43 +1413,23 @@
           <w:i/>
           <w:iCs/>
         </w:rPr>
-        <w:t xml:space="preserve">Also:</w:t>
-      </w:r>
-      <w:r>
-        <w:t xml:space="preserve"> written answers in the answer-type lessons (</w:t>
-      </w:r>
+        <w:t xml:space="preserve">What to do:</w:t>
+      </w:r>
+      <w:r>
+        <w:t xml:space="preserve"> no "passed / failed". Show "Checked: 24 of 39 points. Not checked: the written answers and the essay (61 points)."</w:t>
+      </w:r>
+    </w:p>
+    <w:p>
+      <w:pPr>
+        <w:bidi w:val="false"/>
+        <w:spacing w:after="100"/>
+      </w:pPr>
       <w:r>
         <w:rPr>
           <w:b/>
           <w:bCs/>
-          <w:rtl/>
-        </w:rPr>
-        <w:t xml:space="preserve">תשובה קצרה</w:t>
-      </w:r>
-      <w:r>
-        <w:t xml:space="preserve">, </w:t>
-      </w:r>
-      <w:r>
-        <w:rPr>
-          <w:b/>
-          <w:bCs/>
-          <w:rtl/>
-        </w:rPr>
-        <w:t xml:space="preserve">השלמת משפט</w:t>
-      </w:r>
-      <w:r>
-        <w:t xml:space="preserve">, </w:t>
-      </w:r>
-      <w:r>
-        <w:rPr>
-          <w:b/>
-          <w:bCs/>
-          <w:rtl/>
-        </w:rPr>
-        <w:t xml:space="preserve">שתי תשובות</w:t>
-      </w:r>
-      <w:r>
-        <w:t xml:space="preserve">) are never checked.</w:t>
+        </w:rPr>
+        <w:t xml:space="preserve">2. A few questions have mistakes.</w:t>
       </w:r>
     </w:p>
     <w:p>
@@ -1687,23 +1447,142 @@
           <w:i/>
           <w:iCs/>
         </w:rPr>
-        <w:t xml:space="preserve">Fix:</w:t>
-      </w:r>
-      <w:r>
-        <w:t xml:space="preserve"> turn it into a small real exam, and check short written answers by key words.</w:t>
-      </w:r>
-    </w:p>
-    <w:p>
-      <w:pPr>
-        <w:bidi w:val="false"/>
-        <w:spacing w:after="100"/>
-      </w:pPr>
+        <w:t xml:space="preserve">Where and example:</w:t>
+      </w:r>
+    </w:p>
+    <w:p>
+      <w:pPr>
+        <w:pStyle w:val="ListParagraph"/>
+        <w:numPr>
+          <w:ilvl w:val="1"/>
+          <w:numId w:val="2"/>
+        </w:numPr>
+        <w:bidi w:val="false"/>
+        <w:spacing w:after="60"/>
+      </w:pPr>
+      <w:r>
+        <w:t xml:space="preserve">Reading → </w:t>
+      </w:r>
       <w:r>
         <w:rPr>
           <w:b/>
           <w:bCs/>
         </w:rPr>
-        <w:t xml:space="preserve">9. Vocabulary is long for a strong student.</w:t>
+        <w:t xml:space="preserve">however / but - </w:t>
+      </w:r>
+      <w:r>
+        <w:rPr>
+          <w:b/>
+          <w:bCs/>
+          <w:rtl/>
+        </w:rPr>
+        <w:t xml:space="preserve">כמו במבחן</w:t>
+      </w:r>
+      <w:r>
+        <w:t xml:space="preserve"> → round 3: the text says "Some shop owners say they lose customers to the market, but others say the crowds help their business." The question asks "What do some shop owners say?", and both answers fit.</w:t>
+      </w:r>
+    </w:p>
+    <w:p>
+      <w:pPr>
+        <w:pStyle w:val="ListParagraph"/>
+        <w:numPr>
+          <w:ilvl w:val="1"/>
+          <w:numId w:val="2"/>
+        </w:numPr>
+        <w:bidi w:val="false"/>
+        <w:spacing w:after="60"/>
+      </w:pPr>
+      <w:r>
+        <w:t xml:space="preserve">Practice exam </w:t>
+      </w:r>
+      <w:r>
+        <w:rPr>
+          <w:b/>
+          <w:bCs/>
+          <w:rtl/>
+        </w:rPr>
+        <w:t xml:space="preserve">משקפיים חכמות שעוזרות לעיוורים לראות</w:t>
+      </w:r>
+      <w:r>
+        <w:t xml:space="preserve"> → questions 2-3: question 2's right answer is "They can read words from books and signs out loud", and question 3 then asks to complete "The glasses can also read words from ___ out loud."</w:t>
+      </w:r>
+    </w:p>
+    <w:p>
+      <w:pPr>
+        <w:pStyle w:val="ListParagraph"/>
+        <w:numPr>
+          <w:ilvl w:val="1"/>
+          <w:numId w:val="2"/>
+        </w:numPr>
+        <w:bidi w:val="false"/>
+        <w:spacing w:after="60"/>
+      </w:pPr>
+      <w:r>
+        <w:t xml:space="preserve">The same exam → question 3: the fill-in expects "books, signs, and screens"; a student who writes "books, signs, screens" is marked wrong.</w:t>
+      </w:r>
+    </w:p>
+    <w:p>
+      <w:pPr>
+        <w:pStyle w:val="ListParagraph"/>
+        <w:numPr>
+          <w:ilvl w:val="1"/>
+          <w:numId w:val="2"/>
+        </w:numPr>
+        <w:bidi w:val="false"/>
+        <w:spacing w:after="60"/>
+      </w:pPr>
+      <w:r>
+        <w:t xml:space="preserve">Writing → </w:t>
+      </w:r>
+      <w:r>
+        <w:rPr>
+          <w:b/>
+          <w:bCs/>
+        </w:rPr>
+        <w:t xml:space="preserve">YES or NO - </w:t>
+      </w:r>
+      <w:r>
+        <w:rPr>
+          <w:b/>
+          <w:bCs/>
+          <w:rtl/>
+        </w:rPr>
+        <w:t xml:space="preserve">לומר עמדה</w:t>
+      </w:r>
+      <w:r>
+        <w:t xml:space="preserve"> → round 1: calls "think" a word of agreement, but it shows an opinion.</w:t>
+      </w:r>
+    </w:p>
+    <w:p>
+      <w:pPr>
+        <w:pStyle w:val="ListParagraph"/>
+        <w:numPr>
+          <w:ilvl w:val="1"/>
+          <w:numId w:val="2"/>
+        </w:numPr>
+        <w:bidi w:val="false"/>
+        <w:spacing w:after="60"/>
+      </w:pPr>
+      <w:r>
+        <w:t xml:space="preserve">Writing → </w:t>
+      </w:r>
+      <w:r>
+        <w:rPr>
+          <w:b/>
+          <w:bCs/>
+        </w:rPr>
+        <w:t xml:space="preserve">In addition - </w:t>
+      </w:r>
+      <w:r>
+        <w:rPr>
+          <w:b/>
+          <w:bCs/>
+          <w:rtl/>
+        </w:rPr>
+        <w:t xml:space="preserve">סיבה שנייה</w:t>
+      </w:r>
+      <w:r>
+        <w:t xml:space="preserve"> → round 1: one answer can be argued either way.</w:t>
       </w:r>
     </w:p>
     <w:p>
@@ -1721,10 +1600,33 @@
           <w:i/>
           <w:iCs/>
         </w:rPr>
-        <w:t xml:space="preserve">Example:</w:t>
-      </w:r>
-      <w:r>
-        <w:t xml:space="preserve"> a student who already knows "environment" and "community" still goes through every screen, about 430 in total.</w:t>
+        <w:t xml:space="preserve">What to do:</w:t>
+      </w:r>
+      <w:r>
+        <w:t xml:space="preserve"> ask "What do the </w:t>
+      </w:r>
+      <w:r>
+        <w:rPr>
+          <w:b/>
+          <w:bCs/>
+        </w:rPr>
+        <w:t xml:space="preserve">unhappy</w:t>
+      </w:r>
+      <w:r>
+        <w:t xml:space="preserve"> shop owners say?"; reword question 2's choices; accept small differences in the fill-in; say "opinion" instead of "agreement"; rewrite the debatable question.</w:t>
+      </w:r>
+    </w:p>
+    <w:p>
+      <w:pPr>
+        <w:bidi w:val="false"/>
+        <w:spacing w:after="100"/>
+      </w:pPr>
+      <w:r>
+        <w:rPr>
+          <w:b/>
+          <w:bCs/>
+        </w:rPr>
+        <w:t xml:space="preserve">3. Some tips are still taught as rules that are always true.</w:t>
       </w:r>
     </w:p>
     <w:p>
@@ -1742,10 +1644,68 @@
           <w:i/>
           <w:iCs/>
         </w:rPr>
-        <w:t xml:space="preserve">Also:</w:t>
-      </w:r>
-      <w:r>
-        <w:t xml:space="preserve"> the final vocabulary test is mostly multiple choice (46 of 58 questions).</w:t>
+        <w:t xml:space="preserve">Where:</w:t>
+      </w:r>
+      <w:r>
+        <w:t xml:space="preserve"> Reading → </w:t>
+      </w:r>
+      <w:r>
+        <w:rPr>
+          <w:b/>
+          <w:bCs/>
+        </w:rPr>
+        <w:t xml:space="preserve">however / but - </w:t>
+      </w:r>
+      <w:r>
+        <w:rPr>
+          <w:b/>
+          <w:bCs/>
+          <w:rtl/>
+        </w:rPr>
+        <w:t xml:space="preserve">כמו במבחן</w:t>
+      </w:r>
+      <w:r>
+        <w:t xml:space="preserve"> (round 2), </w:t>
+      </w:r>
+      <w:r>
+        <w:rPr>
+          <w:b/>
+          <w:bCs/>
+        </w:rPr>
+        <w:t xml:space="preserve">most / only - </w:t>
+      </w:r>
+      <w:r>
+        <w:rPr>
+          <w:b/>
+          <w:bCs/>
+          <w:rtl/>
+        </w:rPr>
+        <w:t xml:space="preserve">תרגול שאלות</w:t>
+      </w:r>
+      <w:r>
+        <w:t xml:space="preserve">, </w:t>
+      </w:r>
+      <w:r>
+        <w:rPr>
+          <w:b/>
+          <w:bCs/>
+          <w:rtl/>
+        </w:rPr>
+        <w:t xml:space="preserve">שאלות 1 - סיכום</w:t>
+      </w:r>
+      <w:r>
+        <w:t xml:space="preserve">, and the summary in </w:t>
+      </w:r>
+      <w:r>
+        <w:rPr>
+          <w:b/>
+          <w:bCs/>
+          <w:rtl/>
+        </w:rPr>
+        <w:t xml:space="preserve">אני מחפש, לא קורא</w:t>
+      </w:r>
+      <w:r>
+        <w:t xml:space="preserve">.</w:t>
       </w:r>
     </w:p>
     <w:p>
@@ -1763,23 +1723,40 @@
           <w:i/>
           <w:iCs/>
         </w:rPr>
-        <w:t xml:space="preserve">Fix:</w:t>
-      </w:r>
-      <w:r>
-        <w:t xml:space="preserve"> a short check at the start of each lesson that lets strong students skip it.</w:t>
-      </w:r>
-    </w:p>
-    <w:p>
-      <w:pPr>
-        <w:bidi w:val="false"/>
-        <w:spacing w:after="100"/>
-      </w:pPr>
-      <w:r>
-        <w:rPr>
-          <w:b/>
-          <w:bCs/>
-        </w:rPr>
-        <w:t xml:space="preserve">10. No real student has used it yet.</w:t>
+        <w:t xml:space="preserve">Example:</w:t>
+      </w:r>
+      <w:r>
+        <w:t xml:space="preserve"> a summary screen says "however / but = a turn; what comes after it = the point". But for "What problem do many adults have?" the answer comes </w:t>
+      </w:r>
+      <w:r>
+        <w:rPr>
+          <w:i/>
+          <w:iCs/>
+        </w:rPr>
+        <w:t xml:space="preserve">before</w:t>
+      </w:r>
+      <w:r>
+        <w:t xml:space="preserve"> however. Another lesson says "</w:t>
+      </w:r>
+      <w:r>
+        <w:rPr>
+          <w:i/>
+          <w:iCs/>
+        </w:rPr>
+        <w:t xml:space="preserve">most</w:t>
+      </w:r>
+      <w:r>
+        <w:t xml:space="preserve"> always means one answer", but "</w:t>
+      </w:r>
+      <w:r>
+        <w:rPr>
+          <w:i/>
+          <w:iCs/>
+        </w:rPr>
+        <w:t xml:space="preserve">most</w:t>
+      </w:r>
+      <w:r>
+        <w:t xml:space="preserve"> trees" means the majority.</w:t>
       </w:r>
     </w:p>
     <w:p>
@@ -1793,7 +1770,27 @@
         <w:spacing w:after="60"/>
       </w:pPr>
       <w:r>
-        <w:t xml:space="preserve">Everything here comes from reading the material, not from watching students.</w:t>
+        <w:rPr>
+          <w:i/>
+          <w:iCs/>
+        </w:rPr>
+        <w:t xml:space="preserve">What to do:</w:t>
+      </w:r>
+      <w:r>
+        <w:t xml:space="preserve"> say it as a hint: "usually the point comes after however, but always answer what the question asks".</w:t>
+      </w:r>
+    </w:p>
+    <w:p>
+      <w:pPr>
+        <w:bidi w:val="false"/>
+        <w:spacing w:after="100"/>
+      </w:pPr>
+      <w:r>
+        <w:rPr>
+          <w:b/>
+          <w:bCs/>
+        </w:rPr>
+        <w:t xml:space="preserve">4. The writing check doesn't look at what the student wrote.</w:t>
       </w:r>
     </w:p>
     <w:p>
@@ -1811,7 +1808,857 @@
           <w:i/>
           <w:iCs/>
         </w:rPr>
-        <w:t xml:space="preserve">Fix:</w:t>
+        <w:t xml:space="preserve">Where:</w:t>
+      </w:r>
+      <w:r>
+        <w:t xml:space="preserve"> every writing screen in the Writing lessons.</w:t>
+      </w:r>
+    </w:p>
+    <w:p>
+      <w:pPr>
+        <w:pStyle w:val="ListParagraph"/>
+        <w:numPr>
+          <w:ilvl w:val="0"/>
+          <w:numId w:val="2"/>
+        </w:numPr>
+        <w:bidi w:val="false"/>
+        <w:spacing w:after="60"/>
+      </w:pPr>
+      <w:r>
+        <w:rPr>
+          <w:i/>
+          <w:iCs/>
+        </w:rPr>
+        <w:t xml:space="preserve">Example:</w:t>
+      </w:r>
+      <w:r>
+        <w:t xml:space="preserve"> "In my opinion it is good because it is good. In addition it is good. In conclusion it is good." passes, because it has the linking words. Topic words from the word list (like "travel") never count, because the app looks for "travel / </w:t>
+      </w:r>
+      <w:r>
+        <w:rPr>
+          <w:rtl/>
+        </w:rPr>
+        <w:t xml:space="preserve">לטייל</w:t>
+      </w:r>
+      <w:r>
+        <w:t xml:space="preserve">" as one word.</w:t>
+      </w:r>
+    </w:p>
+    <w:p>
+      <w:pPr>
+        <w:pStyle w:val="ListParagraph"/>
+        <w:numPr>
+          <w:ilvl w:val="0"/>
+          <w:numId w:val="2"/>
+        </w:numPr>
+        <w:bidi w:val="false"/>
+        <w:spacing w:after="60"/>
+      </w:pPr>
+      <w:r>
+        <w:rPr>
+          <w:i/>
+          <w:iCs/>
+        </w:rPr>
+        <w:t xml:space="preserve">What to do:</w:t>
+      </w:r>
+      <w:r>
+        <w:t xml:space="preserve"> count the English word alone; add a word counter; show an example of a good paragraph with a short checklist, clearly marked "check yourself, not graded".</w:t>
+      </w:r>
+    </w:p>
+    <w:p>
+      <w:pPr>
+        <w:bidi w:val="false"/>
+        <w:spacing w:after="100"/>
+      </w:pPr>
+      <w:r>
+        <w:rPr>
+          <w:b/>
+          <w:bCs/>
+        </w:rPr>
+        <w:t xml:space="preserve">5. Students never practise writing a full paragraph.</w:t>
+      </w:r>
+    </w:p>
+    <w:p>
+      <w:pPr>
+        <w:pStyle w:val="ListParagraph"/>
+        <w:numPr>
+          <w:ilvl w:val="0"/>
+          <w:numId w:val="2"/>
+        </w:numPr>
+        <w:bidi w:val="false"/>
+        <w:spacing w:after="60"/>
+      </w:pPr>
+      <w:r>
+        <w:rPr>
+          <w:i/>
+          <w:iCs/>
+        </w:rPr>
+        <w:t xml:space="preserve">Where:</w:t>
+      </w:r>
+      <w:r>
+        <w:t xml:space="preserve"> Writing → the four topic lessons (</w:t>
+      </w:r>
+      <w:r>
+        <w:rPr>
+          <w:b/>
+          <w:bCs/>
+        </w:rPr>
+        <w:t xml:space="preserve">Do you think? - </w:t>
+      </w:r>
+      <w:r>
+        <w:rPr>
+          <w:b/>
+          <w:bCs/>
+          <w:rtl/>
+        </w:rPr>
+        <w:t xml:space="preserve">התנדבות</w:t>
+      </w:r>
+      <w:r>
+        <w:t xml:space="preserve">, </w:t>
+      </w:r>
+      <w:r>
+        <w:rPr>
+          <w:b/>
+          <w:bCs/>
+        </w:rPr>
+        <w:t xml:space="preserve">What do you think? - </w:t>
+      </w:r>
+      <w:r>
+        <w:rPr>
+          <w:b/>
+          <w:bCs/>
+          <w:rtl/>
+        </w:rPr>
+        <w:t xml:space="preserve">חופשה</w:t>
+      </w:r>
+      <w:r>
+        <w:t xml:space="preserve">, </w:t>
+      </w:r>
+      <w:r>
+        <w:rPr>
+          <w:b/>
+          <w:bCs/>
+        </w:rPr>
+        <w:t xml:space="preserve">What changes? - </w:t>
+      </w:r>
+      <w:r>
+        <w:rPr>
+          <w:b/>
+          <w:bCs/>
+          <w:rtl/>
+        </w:rPr>
+        <w:t xml:space="preserve">בית ספר</w:t>
+      </w:r>
+      <w:r>
+        <w:t xml:space="preserve">, </w:t>
+      </w:r>
+      <w:r>
+        <w:rPr>
+          <w:b/>
+          <w:bCs/>
+        </w:rPr>
+        <w:t xml:space="preserve">At what age? - </w:t>
+      </w:r>
+      <w:r>
+        <w:rPr>
+          <w:b/>
+          <w:bCs/>
+          <w:rtl/>
+        </w:rPr>
+        <w:t xml:space="preserve">פלאפונים</w:t>
+      </w:r>
+      <w:r>
+        <w:t xml:space="preserve">) and the seven skill lessons.</w:t>
+      </w:r>
+    </w:p>
+    <w:p>
+      <w:pPr>
+        <w:pStyle w:val="ListParagraph"/>
+        <w:numPr>
+          <w:ilvl w:val="0"/>
+          <w:numId w:val="2"/>
+        </w:numPr>
+        <w:bidi w:val="false"/>
+        <w:spacing w:after="60"/>
+      </w:pPr>
+      <w:r>
+        <w:rPr>
+          <w:i/>
+          <w:iCs/>
+        </w:rPr>
+        <w:t xml:space="preserve">Example:</w:t>
+      </w:r>
+      <w:r>
+        <w:t xml:space="preserve"> a topic lesson asks for "70-90 words", but gives five separate one-line boxes and no word count. Students never see a model answer. The writing practice in the skill lessons can be skipped.</w:t>
+      </w:r>
+    </w:p>
+    <w:p>
+      <w:pPr>
+        <w:pStyle w:val="ListParagraph"/>
+        <w:numPr>
+          <w:ilvl w:val="0"/>
+          <w:numId w:val="2"/>
+        </w:numPr>
+        <w:bidi w:val="false"/>
+        <w:spacing w:after="60"/>
+      </w:pPr>
+      <w:r>
+        <w:rPr>
+          <w:i/>
+          <w:iCs/>
+        </w:rPr>
+        <w:t xml:space="preserve">What to do:</w:t>
+      </w:r>
+      <w:r>
+        <w:t xml:space="preserve"> one paragraph box with a word counter (the practice exams already have one), an example paragraph, and one required full paragraph per topic lesson (needs your OK).</w:t>
+      </w:r>
+    </w:p>
+    <w:p>
+      <w:pPr>
+        <w:bidi w:val="false"/>
+        <w:spacing w:after="100"/>
+      </w:pPr>
+      <w:r>
+        <w:rPr>
+          <w:b/>
+          <w:bCs/>
+        </w:rPr>
+        <w:t xml:space="preserve">6. Some writing screens have lines stuck together.</w:t>
+      </w:r>
+    </w:p>
+    <w:p>
+      <w:pPr>
+        <w:pStyle w:val="ListParagraph"/>
+        <w:numPr>
+          <w:ilvl w:val="0"/>
+          <w:numId w:val="2"/>
+        </w:numPr>
+        <w:bidi w:val="false"/>
+        <w:spacing w:after="60"/>
+      </w:pPr>
+      <w:r>
+        <w:rPr>
+          <w:i/>
+          <w:iCs/>
+        </w:rPr>
+        <w:t xml:space="preserve">Where:</w:t>
+      </w:r>
+      <w:r>
+        <w:t xml:space="preserve"> Writing → opening screens of </w:t>
+      </w:r>
+      <w:r>
+        <w:rPr>
+          <w:b/>
+          <w:bCs/>
+        </w:rPr>
+        <w:t xml:space="preserve">YES or NO - </w:t>
+      </w:r>
+      <w:r>
+        <w:rPr>
+          <w:b/>
+          <w:bCs/>
+          <w:rtl/>
+        </w:rPr>
+        <w:t xml:space="preserve">לומר עמדה</w:t>
+      </w:r>
+      <w:r>
+        <w:t xml:space="preserve">, </w:t>
+      </w:r>
+      <w:r>
+        <w:rPr>
+          <w:b/>
+          <w:bCs/>
+        </w:rPr>
+        <w:t xml:space="preserve">What do you think? - </w:t>
+      </w:r>
+      <w:r>
+        <w:rPr>
+          <w:b/>
+          <w:bCs/>
+          <w:rtl/>
+        </w:rPr>
+        <w:t xml:space="preserve">חופשה</w:t>
+      </w:r>
+      <w:r>
+        <w:t xml:space="preserve">, </w:t>
+      </w:r>
+      <w:r>
+        <w:rPr>
+          <w:b/>
+          <w:bCs/>
+        </w:rPr>
+        <w:t xml:space="preserve">At what age? - </w:t>
+      </w:r>
+      <w:r>
+        <w:rPr>
+          <w:b/>
+          <w:bCs/>
+          <w:rtl/>
+        </w:rPr>
+        <w:t xml:space="preserve">פלאפונים</w:t>
+      </w:r>
+      <w:r>
+        <w:t xml:space="preserve">.</w:t>
+      </w:r>
+    </w:p>
+    <w:p>
+      <w:pPr>
+        <w:pStyle w:val="ListParagraph"/>
+        <w:numPr>
+          <w:ilvl w:val="0"/>
+          <w:numId w:val="2"/>
+        </w:numPr>
+        <w:bidi w:val="false"/>
+        <w:spacing w:after="60"/>
+      </w:pPr>
+      <w:r>
+        <w:rPr>
+          <w:i/>
+          <w:iCs/>
+        </w:rPr>
+        <w:t xml:space="preserve">Example:</w:t>
+      </w:r>
+      <w:r>
+        <w:t xml:space="preserve"> "</w:t>
+      </w:r>
+      <w:r>
+        <w:rPr>
+          <w:rtl/>
+        </w:rPr>
+        <w:t xml:space="preserve">לא כתיב.לא דקדוק</w:t>
+      </w:r>
+      <w:r>
+        <w:t xml:space="preserve">" and "It helps...It improves...It teaches" run together on one line.</w:t>
+      </w:r>
+    </w:p>
+    <w:p>
+      <w:pPr>
+        <w:pStyle w:val="ListParagraph"/>
+        <w:numPr>
+          <w:ilvl w:val="0"/>
+          <w:numId w:val="2"/>
+        </w:numPr>
+        <w:bidi w:val="false"/>
+        <w:spacing w:after="60"/>
+      </w:pPr>
+      <w:r>
+        <w:rPr>
+          <w:i/>
+          <w:iCs/>
+        </w:rPr>
+        <w:t xml:space="preserve">What to do:</w:t>
+      </w:r>
+      <w:r>
+        <w:t xml:space="preserve"> tidy them, the way it was done for Vocabulary and Reading.</w:t>
+      </w:r>
+    </w:p>
+    <w:p>
+      <w:pPr>
+        <w:bidi w:val="false"/>
+        <w:spacing w:after="100"/>
+      </w:pPr>
+      <w:r>
+        <w:rPr>
+          <w:b/>
+          <w:bCs/>
+        </w:rPr>
+        <w:t xml:space="preserve">7. Half of the reading lessons haven't been updated yet.</w:t>
+      </w:r>
+    </w:p>
+    <w:p>
+      <w:pPr>
+        <w:pStyle w:val="ListParagraph"/>
+        <w:numPr>
+          <w:ilvl w:val="0"/>
+          <w:numId w:val="2"/>
+        </w:numPr>
+        <w:bidi w:val="false"/>
+        <w:spacing w:after="60"/>
+      </w:pPr>
+      <w:r>
+        <w:rPr>
+          <w:i/>
+          <w:iCs/>
+        </w:rPr>
+        <w:t xml:space="preserve">Where:</w:t>
+      </w:r>
+      <w:r>
+        <w:t xml:space="preserve"> Reading → </w:t>
+      </w:r>
+      <w:r>
+        <w:rPr>
+          <w:b/>
+          <w:bCs/>
+          <w:rtl/>
+        </w:rPr>
+        <w:t xml:space="preserve">מגנט לעין - מספרים ושמות</w:t>
+      </w:r>
+      <w:r>
+        <w:t xml:space="preserve"> + </w:t>
+      </w:r>
+      <w:r>
+        <w:rPr>
+          <w:b/>
+          <w:bCs/>
+          <w:rtl/>
+        </w:rPr>
+        <w:t xml:space="preserve">מספרים ושמות - תרגול שאלות</w:t>
+      </w:r>
+      <w:r>
+        <w:t xml:space="preserve">, </w:t>
+      </w:r>
+      <w:r>
+        <w:rPr>
+          <w:b/>
+          <w:bCs/>
+        </w:rPr>
+        <w:t xml:space="preserve">most / only - </w:t>
+      </w:r>
+      <w:r>
+        <w:rPr>
+          <w:b/>
+          <w:bCs/>
+          <w:rtl/>
+        </w:rPr>
+        <w:t xml:space="preserve">תשובה אחת</w:t>
+      </w:r>
+      <w:r>
+        <w:t xml:space="preserve"> + </w:t>
+      </w:r>
+      <w:r>
+        <w:rPr>
+          <w:b/>
+          <w:bCs/>
+        </w:rPr>
+        <w:t xml:space="preserve">most / only - </w:t>
+      </w:r>
+      <w:r>
+        <w:rPr>
+          <w:b/>
+          <w:bCs/>
+          <w:rtl/>
+        </w:rPr>
+        <w:t xml:space="preserve">תרגול שאלות</w:t>
+      </w:r>
+      <w:r>
+        <w:t xml:space="preserve">, and the other single lessons (</w:t>
+      </w:r>
+      <w:r>
+        <w:rPr>
+          <w:b/>
+          <w:bCs/>
+          <w:rtl/>
+        </w:rPr>
+        <w:t xml:space="preserve">מפת הדרכים</w:t>
+      </w:r>
+      <w:r>
+        <w:t xml:space="preserve">, </w:t>
+      </w:r>
+      <w:r>
+        <w:rPr>
+          <w:b/>
+          <w:bCs/>
+          <w:rtl/>
+        </w:rPr>
+        <w:t xml:space="preserve">שיטת הרמזור</w:t>
+      </w:r>
+      <w:r>
+        <w:t xml:space="preserve">, </w:t>
+      </w:r>
+      <w:r>
+        <w:rPr>
+          <w:b/>
+          <w:bCs/>
+        </w:rPr>
+        <w:t xml:space="preserve">P1 - </w:t>
+      </w:r>
+      <w:r>
+        <w:rPr>
+          <w:b/>
+          <w:bCs/>
+          <w:rtl/>
+        </w:rPr>
+        <w:t xml:space="preserve">ניווט בטקסט</w:t>
+      </w:r>
+      <w:r>
+        <w:t xml:space="preserve">, </w:t>
+      </w:r>
+      <w:r>
+        <w:rPr>
+          <w:b/>
+          <w:bCs/>
+          <w:rtl/>
+        </w:rPr>
+        <w:t xml:space="preserve">שאלות אמריקאיות</w:t>
+      </w:r>
+      <w:r>
+        <w:t xml:space="preserve">, </w:t>
+      </w:r>
+      <w:r>
+        <w:rPr>
+          <w:b/>
+          <w:bCs/>
+          <w:rtl/>
+        </w:rPr>
+        <w:t xml:space="preserve">תשובה קצרה</w:t>
+      </w:r>
+      <w:r>
+        <w:t xml:space="preserve">, </w:t>
+      </w:r>
+      <w:r>
+        <w:rPr>
+          <w:b/>
+          <w:bCs/>
+          <w:rtl/>
+        </w:rPr>
+        <w:t xml:space="preserve">השלמת משפט</w:t>
+      </w:r>
+      <w:r>
+        <w:t xml:space="preserve">, </w:t>
+      </w:r>
+      <w:r>
+        <w:rPr>
+          <w:b/>
+          <w:bCs/>
+          <w:rtl/>
+        </w:rPr>
+        <w:t xml:space="preserve">שתי תשובות</w:t>
+      </w:r>
+      <w:r>
+        <w:t xml:space="preserve">).</w:t>
+      </w:r>
+    </w:p>
+    <w:p>
+      <w:pPr>
+        <w:pStyle w:val="ListParagraph"/>
+        <w:numPr>
+          <w:ilvl w:val="0"/>
+          <w:numId w:val="2"/>
+        </w:numPr>
+        <w:bidi w:val="false"/>
+        <w:spacing w:after="60"/>
+      </w:pPr>
+      <w:r>
+        <w:rPr>
+          <w:i/>
+          <w:iCs/>
+        </w:rPr>
+        <w:t xml:space="preserve">Example:</w:t>
+      </w:r>
+      <w:r>
+        <w:t xml:space="preserve"> the most/only lesson still has an easy true/false round ("true or false: MOST means one answer"), and students can move on without ever trying a new text.</w:t>
+      </w:r>
+    </w:p>
+    <w:p>
+      <w:pPr>
+        <w:pStyle w:val="ListParagraph"/>
+        <w:numPr>
+          <w:ilvl w:val="0"/>
+          <w:numId w:val="2"/>
+        </w:numPr>
+        <w:bidi w:val="false"/>
+        <w:spacing w:after="60"/>
+      </w:pPr>
+      <w:r>
+        <w:rPr>
+          <w:i/>
+          <w:iCs/>
+        </w:rPr>
+        <w:t xml:space="preserve">What to do:</w:t>
+      </w:r>
+      <w:r>
+        <w:t xml:space="preserve"> the same pattern as the NOT and however lessons: rules, practice, then a required new text. Needs new texts.</w:t>
+      </w:r>
+    </w:p>
+    <w:p>
+      <w:pPr>
+        <w:bidi w:val="false"/>
+        <w:spacing w:after="100"/>
+      </w:pPr>
+      <w:r>
+        <w:rPr>
+          <w:b/>
+          <w:bCs/>
+        </w:rPr>
+        <w:t xml:space="preserve">8. The last reading lesson doesn't look like the exam.</w:t>
+      </w:r>
+    </w:p>
+    <w:p>
+      <w:pPr>
+        <w:pStyle w:val="ListParagraph"/>
+        <w:numPr>
+          <w:ilvl w:val="0"/>
+          <w:numId w:val="2"/>
+        </w:numPr>
+        <w:bidi w:val="false"/>
+        <w:spacing w:after="60"/>
+      </w:pPr>
+      <w:r>
+        <w:rPr>
+          <w:i/>
+          <w:iCs/>
+        </w:rPr>
+        <w:t xml:space="preserve">Where:</w:t>
+      </w:r>
+      <w:r>
+        <w:t xml:space="preserve"> Reading → </w:t>
+      </w:r>
+      <w:r>
+        <w:rPr>
+          <w:b/>
+          <w:bCs/>
+          <w:rtl/>
+        </w:rPr>
+        <w:t xml:space="preserve">חלק 1 - סיכום</w:t>
+      </w:r>
+      <w:r>
+        <w:t xml:space="preserve">, and the answer-type lessons </w:t>
+      </w:r>
+      <w:r>
+        <w:rPr>
+          <w:b/>
+          <w:bCs/>
+          <w:rtl/>
+        </w:rPr>
+        <w:t xml:space="preserve">תשובה קצרה</w:t>
+      </w:r>
+      <w:r>
+        <w:t xml:space="preserve">, </w:t>
+      </w:r>
+      <w:r>
+        <w:rPr>
+          <w:b/>
+          <w:bCs/>
+          <w:rtl/>
+        </w:rPr>
+        <w:t xml:space="preserve">השלמת משפט</w:t>
+      </w:r>
+      <w:r>
+        <w:t xml:space="preserve">, </w:t>
+      </w:r>
+      <w:r>
+        <w:rPr>
+          <w:b/>
+          <w:bCs/>
+          <w:rtl/>
+        </w:rPr>
+        <w:t xml:space="preserve">שתי תשובות</w:t>
+      </w:r>
+      <w:r>
+        <w:t xml:space="preserve">.</w:t>
+      </w:r>
+    </w:p>
+    <w:p>
+      <w:pPr>
+        <w:pStyle w:val="ListParagraph"/>
+        <w:numPr>
+          <w:ilvl w:val="0"/>
+          <w:numId w:val="2"/>
+        </w:numPr>
+        <w:bidi w:val="false"/>
+        <w:spacing w:after="60"/>
+      </w:pPr>
+      <w:r>
+        <w:rPr>
+          <w:i/>
+          <w:iCs/>
+        </w:rPr>
+        <w:t xml:space="preserve">Example:</w:t>
+      </w:r>
+      <w:r>
+        <w:t xml:space="preserve"> </w:t>
+      </w:r>
+      <w:r>
+        <w:rPr>
+          <w:b/>
+          <w:bCs/>
+          <w:rtl/>
+        </w:rPr>
+        <w:t xml:space="preserve">חלק 1 - סיכום</w:t>
+      </w:r>
+      <w:r>
+        <w:t xml:space="preserve"> has a 113-word text and only multiple-choice questions; the real exam has about 340 words and 9 questions, 5 of them written. In the answer-type lessons, written answers are never checked.</w:t>
+      </w:r>
+    </w:p>
+    <w:p>
+      <w:pPr>
+        <w:pStyle w:val="ListParagraph"/>
+        <w:numPr>
+          <w:ilvl w:val="0"/>
+          <w:numId w:val="2"/>
+        </w:numPr>
+        <w:bidi w:val="false"/>
+        <w:spacing w:after="60"/>
+      </w:pPr>
+      <w:r>
+        <w:rPr>
+          <w:i/>
+          <w:iCs/>
+        </w:rPr>
+        <w:t xml:space="preserve">What to do:</w:t>
+      </w:r>
+      <w:r>
+        <w:t xml:space="preserve"> turn it into a small real exam, and check short written answers by key words.</w:t>
+      </w:r>
+    </w:p>
+    <w:p>
+      <w:pPr>
+        <w:bidi w:val="false"/>
+        <w:spacing w:after="100"/>
+      </w:pPr>
+      <w:r>
+        <w:rPr>
+          <w:b/>
+          <w:bCs/>
+        </w:rPr>
+        <w:t xml:space="preserve">9. Vocabulary is long for a strong student.</w:t>
+      </w:r>
+    </w:p>
+    <w:p>
+      <w:pPr>
+        <w:pStyle w:val="ListParagraph"/>
+        <w:numPr>
+          <w:ilvl w:val="0"/>
+          <w:numId w:val="2"/>
+        </w:numPr>
+        <w:bidi w:val="false"/>
+        <w:spacing w:after="60"/>
+      </w:pPr>
+      <w:r>
+        <w:rPr>
+          <w:i/>
+          <w:iCs/>
+        </w:rPr>
+        <w:t xml:space="preserve">Where:</w:t>
+      </w:r>
+      <w:r>
+        <w:t xml:space="preserve"> Vocabulary → the six content-word lessons and </w:t>
+      </w:r>
+      <w:r>
+        <w:rPr>
+          <w:b/>
+          <w:bCs/>
+          <w:rtl/>
+        </w:rPr>
+        <w:t xml:space="preserve">מבחן סיכום - אוצר מילים</w:t>
+      </w:r>
+      <w:r>
+        <w:t xml:space="preserve">.</w:t>
+      </w:r>
+    </w:p>
+    <w:p>
+      <w:pPr>
+        <w:pStyle w:val="ListParagraph"/>
+        <w:numPr>
+          <w:ilvl w:val="0"/>
+          <w:numId w:val="2"/>
+        </w:numPr>
+        <w:bidi w:val="false"/>
+        <w:spacing w:after="60"/>
+      </w:pPr>
+      <w:r>
+        <w:rPr>
+          <w:i/>
+          <w:iCs/>
+        </w:rPr>
+        <w:t xml:space="preserve">Example:</w:t>
+      </w:r>
+      <w:r>
+        <w:t xml:space="preserve"> a student who already knows "environment" and "community" still goes through every screen, about 430 in total. The final test is still mostly multiple choice (46 of 58 questions).</w:t>
+      </w:r>
+    </w:p>
+    <w:p>
+      <w:pPr>
+        <w:pStyle w:val="ListParagraph"/>
+        <w:numPr>
+          <w:ilvl w:val="0"/>
+          <w:numId w:val="2"/>
+        </w:numPr>
+        <w:bidi w:val="false"/>
+        <w:spacing w:after="60"/>
+      </w:pPr>
+      <w:r>
+        <w:rPr>
+          <w:i/>
+          <w:iCs/>
+        </w:rPr>
+        <w:t xml:space="preserve">What to do:</w:t>
+      </w:r>
+      <w:r>
+        <w:t xml:space="preserve"> a short check at the start of each lesson that lets strong students skip it.</w:t>
+      </w:r>
+    </w:p>
+    <w:p>
+      <w:pPr>
+        <w:bidi w:val="false"/>
+        <w:spacing w:after="100"/>
+      </w:pPr>
+      <w:r>
+        <w:rPr>
+          <w:b/>
+          <w:bCs/>
+        </w:rPr>
+        <w:t xml:space="preserve">10. No real student has used it yet.</w:t>
+      </w:r>
+    </w:p>
+    <w:p>
+      <w:pPr>
+        <w:pStyle w:val="ListParagraph"/>
+        <w:numPr>
+          <w:ilvl w:val="0"/>
+          <w:numId w:val="2"/>
+        </w:numPr>
+        <w:bidi w:val="false"/>
+        <w:spacing w:after="60"/>
+      </w:pPr>
+      <w:r>
+        <w:rPr>
+          <w:i/>
+          <w:iCs/>
+        </w:rPr>
+        <w:t xml:space="preserve">Where:</w:t>
+      </w:r>
+      <w:r>
+        <w:t xml:space="preserve"> the whole module.</w:t>
+      </w:r>
+    </w:p>
+    <w:p>
+      <w:pPr>
+        <w:pStyle w:val="ListParagraph"/>
+        <w:numPr>
+          <w:ilvl w:val="0"/>
+          <w:numId w:val="2"/>
+        </w:numPr>
+        <w:bidi w:val="false"/>
+        <w:spacing w:after="60"/>
+      </w:pPr>
+      <w:r>
+        <w:rPr>
+          <w:i/>
+          <w:iCs/>
+        </w:rPr>
+        <w:t xml:space="preserve">Example:</w:t>
+      </w:r>
+      <w:r>
+        <w:t xml:space="preserve"> everything in this report comes from reading the material, not from watching students use it.</w:t>
+      </w:r>
+    </w:p>
+    <w:p>
+      <w:pPr>
+        <w:pStyle w:val="ListParagraph"/>
+        <w:numPr>
+          <w:ilvl w:val="0"/>
+          <w:numId w:val="2"/>
+        </w:numPr>
+        <w:bidi w:val="false"/>
+        <w:spacing w:after="60"/>
+      </w:pPr>
+      <w:r>
+        <w:rPr>
+          <w:i/>
+          <w:iCs/>
+        </w:rPr>
+        <w:t xml:space="preserve">What to do:</w:t>
       </w:r>
       <w:r>
         <w:t xml:space="preserve"> let 2-3 students (weak, average, strong) use it for 20-30 minutes each, and note where they get stuck.</w:t>
@@ -1820,7 +2667,6 @@
     <w:p>
       <w:pPr>
         <w:pStyle w:val="Heading1"/>
-        <w:pageBreakBefore/>
       </w:pPr>
       <w:r>
         <w:t xml:space="preserve">4. The plan, in order</w:t>
@@ -3085,7 +3931,6 @@
     <w:p>
       <w:pPr>
         <w:pStyle w:val="Heading1"/>
-        <w:pageBreakBefore/>
       </w:pPr>
       <w:r>
         <w:t xml:space="preserve">5. Already fixed</w:t>
@@ -3220,7 +4065,6 @@
     <w:p>
       <w:pPr>
         <w:pStyle w:val="Heading1"/>
-        <w:pageBreakBefore/>
       </w:pPr>
       <w:r>
         <w:t xml:space="preserve">6. For reference: scores and decisions</w:t>
@@ -36986,6 +37830,23 @@
       </w:r>
       <w:r>
         <w:t xml:space="preserve"> both recommend implementing the work order rather than more review rounds.</w:t>
+      </w:r>
+    </w:p>
+    <w:p>
+      <w:pPr>
+        <w:pStyle w:val="Heading2"/>
+      </w:pPr>
+      <w:r>
+        <w:t xml:space="preserve">Version 2.2, revised the same day (2026-09-30)</w:t>
+      </w:r>
+    </w:p>
+    <w:p>
+      <w:pPr>
+        <w:bidi w:val="false"/>
+        <w:spacing w:after="100"/>
+      </w:pPr>
+      <w:r>
+        <w:t xml:space="preserve">Owner request: "what's good and bad, where it exists today, examples, what to do". In the top part, every good and bad point now has the same four parts: what it is, where it is in the app, an example, and what to do. The good points gained a "where" and a "what to do" each, plus one new good point (the practice exams look like the real Bagrut). The bad points kept their content, reordered to the same four parts. No findings, scores or decisions changed. The version before this revision is in git (commit 4b78e94).</w:t>
       </w:r>
     </w:p>
     <w:sectPr>

</xml_diff>